<commit_message>
docs: regenerate command-interface.docx and NCMP_개발상세서.docx
Rebuild the two .docx whose .md changed on this branch (host-managed context
option, AES-GCM multipart + CTX_FREE CIs, and the line-reference re-sync).
Generated with pandoc (gfm->docx, --toc); validated via zip integrity, content
check (CTX_FREE / AES_GCM_UPDATE / NCMP_HOST_MANAGED_CTX present) and a
LibreOffice PDF render. session-state-management.docx / stdll-call-flow.docx are
unchanged (their .md did not change on this branch).

Co-Authored-By: Claude Opus 4.8 <noreply@anthropic.com>
Claude-Session: https://claude.ai/code/session_01LhC1NS7mCJ3NqHZbsLbZJX
</commit_message>
<xml_diff>
--- a/docs/command-interface.docx
+++ b/docs/command-interface.docx
@@ -1426,7 +1426,7 @@
         <w:rPr>
           <w:rStyle w:val="CommentTok"/>
         </w:rPr>
-        <w:t xml:space="preserve">/* 0x0012 */</w:t>
+        <w:t xml:space="preserve">/* 0x0012 (one-shot) */</w:t>
       </w:r>
       <w:r>
         <w:br/>
@@ -1442,6 +1442,66 @@
           <w:rStyle w:val="CommentTok"/>
         </w:rPr>
         <w:t xml:space="preserve">/* 0x0013 */</w:t>
+      </w:r>
+      <w:r>
+        <w:br/>
+      </w:r>
+      <w:r>
+        <w:rPr>
+          <w:rStyle w:val="NormalTok"/>
+        </w:rPr>
+        <w:t xml:space="preserve">    CI_CMD_AES_GCM_INIT    = NCMP_CMD_AES_GCM_INIT,    </w:t>
+      </w:r>
+      <w:r>
+        <w:rPr>
+          <w:rStyle w:val="CommentTok"/>
+        </w:rPr>
+        <w:t xml:space="preserve">/* 0x0014 (multipart) */</w:t>
+      </w:r>
+      <w:r>
+        <w:br/>
+      </w:r>
+      <w:r>
+        <w:rPr>
+          <w:rStyle w:val="NormalTok"/>
+        </w:rPr>
+        <w:t xml:space="preserve">    CI_CMD_AES_GCM_UPDATE  = NCMP_CMD_AES_GCM_UPDATE,  </w:t>
+      </w:r>
+      <w:r>
+        <w:rPr>
+          <w:rStyle w:val="CommentTok"/>
+        </w:rPr>
+        <w:t xml:space="preserve">/* 0x0015 */</w:t>
+      </w:r>
+      <w:r>
+        <w:br/>
+      </w:r>
+      <w:r>
+        <w:rPr>
+          <w:rStyle w:val="NormalTok"/>
+        </w:rPr>
+        <w:t xml:space="preserve">    CI_CMD_AES_GCM_FINAL   = NCMP_CMD_AES_GCM_FINAL,   </w:t>
+      </w:r>
+      <w:r>
+        <w:rPr>
+          <w:rStyle w:val="CommentTok"/>
+        </w:rPr>
+        <w:t xml:space="preserve">/* 0x0016 */</w:t>
+      </w:r>
+      <w:r>
+        <w:br/>
+      </w:r>
+      <w:r>
+        <w:rPr>
+          <w:rStyle w:val="NormalTok"/>
+        </w:rPr>
+        <w:t xml:space="preserve">    CI_CMD_CTX_FREE        = NCMP_CMD_CTX_FREE,         </w:t>
+      </w:r>
+      <w:r>
+        <w:rPr>
+          <w:rStyle w:val="CommentTok"/>
+        </w:rPr>
+        <w:t xml:space="preserve">/* 0x0017 (abort) */</w:t>
       </w:r>
       <w:r>
         <w:br/>
@@ -3767,6 +3827,292 @@
       </w:r>
     </w:p>
     <w:p>
+      <w:pPr>
+        <w:pStyle w:val="Heading3"/>
+      </w:pPr>
+      <w:bookmarkStart w:id="39" w:name="Xb8debb8a73409dc96903e6a46d13d29e4f45097"/>
+      <w:r>
+        <w:t xml:space="preserve">4.3 CI_CMD_AES_GCM_INIT/UPDATE/FINAL (0x0014–0x0016) — 멀티파트 GCM</w:t>
+      </w:r>
+      <w:bookmarkEnd w:id="39"/>
+    </w:p>
+    <w:p>
+      <w:pPr>
+        <w:pStyle w:val="FirstParagraph"/>
+      </w:pPr>
+      <w:r>
+        <w:t xml:space="preserve">상태형(컨텍스트) 연산이다. 컨텍스트 배치는 §11의 두 모델을 따른다.</w:t>
+      </w:r>
+    </w:p>
+    <w:p>
+      <w:pPr>
+        <w:pStyle w:val="SourceCode"/>
+      </w:pPr>
+      <w:r>
+        <w:rPr>
+          <w:rStyle w:val="CommentTok"/>
+        </w:rPr>
+        <w:t xml:space="preserve">/* INIT: [flags|key|iv|aad|taglen] -&gt; 응답 param0 = 컨텍스트(슬롯). */</w:t>
+      </w:r>
+      <w:r>
+        <w:br/>
+      </w:r>
+      <w:r>
+        <w:rPr>
+          <w:rStyle w:val="KeywordTok"/>
+        </w:rPr>
+        <w:t xml:space="preserve">typedef</w:t>
+      </w:r>
+      <w:r>
+        <w:rPr>
+          <w:rStyle w:val="NormalTok"/>
+        </w:rPr>
+        <w:t xml:space="preserve"> </w:t>
+      </w:r>
+      <w:r>
+        <w:rPr>
+          <w:rStyle w:val="KeywordTok"/>
+        </w:rPr>
+        <w:t xml:space="preserve">struct</w:t>
+      </w:r>
+      <w:r>
+        <w:rPr>
+          <w:rStyle w:val="NormalTok"/>
+        </w:rPr>
+        <w:t xml:space="preserve"> CI_AesGcmInitReq {</w:t>
+      </w:r>
+      <w:r>
+        <w:br/>
+      </w:r>
+      <w:r>
+        <w:rPr>
+          <w:rStyle w:val="NormalTok"/>
+        </w:rPr>
+        <w:t xml:space="preserve">    </w:t>
+      </w:r>
+      <w:r>
+        <w:rPr>
+          <w:rStyle w:val="DataTypeTok"/>
+        </w:rPr>
+        <w:t xml:space="preserve">uint32_t</w:t>
+      </w:r>
+      <w:r>
+        <w:rPr>
+          <w:rStyle w:val="NormalTok"/>
+        </w:rPr>
+        <w:t xml:space="preserve"> flags;   </w:t>
+      </w:r>
+      <w:r>
+        <w:rPr>
+          <w:rStyle w:val="CommentTok"/>
+        </w:rPr>
+        <w:t xml:space="preserve">/* param0: bit0=암/복호 */</w:t>
+      </w:r>
+      <w:r>
+        <w:br/>
+      </w:r>
+      <w:r>
+        <w:rPr>
+          <w:rStyle w:val="NormalTok"/>
+        </w:rPr>
+        <w:t xml:space="preserve">    </w:t>
+      </w:r>
+      <w:r>
+        <w:rPr>
+          <w:rStyle w:val="DataTypeTok"/>
+        </w:rPr>
+        <w:t xml:space="preserve">uint8_t</w:t>
+      </w:r>
+      <w:r>
+        <w:rPr>
+          <w:rStyle w:val="NormalTok"/>
+        </w:rPr>
+        <w:t xml:space="preserve">  key[];   </w:t>
+      </w:r>
+      <w:r>
+        <w:rPr>
+          <w:rStyle w:val="CommentTok"/>
+        </w:rPr>
+        <w:t xml:space="preserve">/* param1 */</w:t>
+      </w:r>
+      <w:r>
+        <w:br/>
+      </w:r>
+      <w:r>
+        <w:rPr>
+          <w:rStyle w:val="NormalTok"/>
+        </w:rPr>
+        <w:t xml:space="preserve">    </w:t>
+      </w:r>
+      <w:r>
+        <w:rPr>
+          <w:rStyle w:val="DataTypeTok"/>
+        </w:rPr>
+        <w:t xml:space="preserve">uint8_t</w:t>
+      </w:r>
+      <w:r>
+        <w:rPr>
+          <w:rStyle w:val="NormalTok"/>
+        </w:rPr>
+        <w:t xml:space="preserve">  iv[];    </w:t>
+      </w:r>
+      <w:r>
+        <w:rPr>
+          <w:rStyle w:val="CommentTok"/>
+        </w:rPr>
+        <w:t xml:space="preserve">/* param2 */</w:t>
+      </w:r>
+      <w:r>
+        <w:br/>
+      </w:r>
+      <w:r>
+        <w:rPr>
+          <w:rStyle w:val="NormalTok"/>
+        </w:rPr>
+        <w:t xml:space="preserve">    </w:t>
+      </w:r>
+      <w:r>
+        <w:rPr>
+          <w:rStyle w:val="DataTypeTok"/>
+        </w:rPr>
+        <w:t xml:space="preserve">uint8_t</w:t>
+      </w:r>
+      <w:r>
+        <w:rPr>
+          <w:rStyle w:val="NormalTok"/>
+        </w:rPr>
+        <w:t xml:space="preserve">  aad[];   </w:t>
+      </w:r>
+      <w:r>
+        <w:rPr>
+          <w:rStyle w:val="CommentTok"/>
+        </w:rPr>
+        <w:t xml:space="preserve">/* param3 (가능) */</w:t>
+      </w:r>
+      <w:r>
+        <w:br/>
+      </w:r>
+      <w:r>
+        <w:rPr>
+          <w:rStyle w:val="NormalTok"/>
+        </w:rPr>
+        <w:t xml:space="preserve">    </w:t>
+      </w:r>
+      <w:r>
+        <w:rPr>
+          <w:rStyle w:val="DataTypeTok"/>
+        </w:rPr>
+        <w:t xml:space="preserve">uint32_t</w:t>
+      </w:r>
+      <w:r>
+        <w:rPr>
+          <w:rStyle w:val="NormalTok"/>
+        </w:rPr>
+        <w:t xml:space="preserve"> taglen;  </w:t>
+      </w:r>
+      <w:r>
+        <w:rPr>
+          <w:rStyle w:val="CommentTok"/>
+        </w:rPr>
+        <w:t xml:space="preserve">/* param4: 태그 바이트 수 */</w:t>
+      </w:r>
+      <w:r>
+        <w:br/>
+      </w:r>
+      <w:r>
+        <w:rPr>
+          <w:rStyle w:val="NormalTok"/>
+        </w:rPr>
+        <w:t xml:space="preserve">} CI_AesGcmInitReq;</w:t>
+      </w:r>
+      <w:r>
+        <w:br/>
+      </w:r>
+      <w:r>
+        <w:br/>
+      </w:r>
+      <w:r>
+        <w:rPr>
+          <w:rStyle w:val="CommentTok"/>
+        </w:rPr>
+        <w:t xml:space="preserve">/* UPDATE: [ctx|data] -&gt; [ctx'|out]. STDLL 관점: [ctx_id|data] -&gt; [out]. */</w:t>
+      </w:r>
+      <w:r>
+        <w:br/>
+      </w:r>
+      <w:r>
+        <w:rPr>
+          <w:rStyle w:val="CommentTok"/>
+        </w:rPr>
+        <w:t xml:space="preserve">/* FINAL(암호화): [ctx] -&gt; [tag]. FINAL(복호화): [ctx|expected_tag] -&gt; ack. */</w:t>
+      </w:r>
+    </w:p>
+    <w:p>
+      <w:pPr>
+        <w:pStyle w:val="BlockText"/>
+      </w:pPr>
+      <w:r>
+        <w:rPr>
+          <w:rStyle w:val="VerbatimChar"/>
+        </w:rPr>
+        <w:t xml:space="preserve">param0</w:t>
+      </w:r>
+      <w:r>
+        <w:t xml:space="preserve">은 UPDATE/FINAL 요청과 INIT 응답에서 컨텍스트 슬롯(STDLL=id, 토큰=blob)이며,</w:t>
+      </w:r>
+      <w:r>
+        <w:t xml:space="preserve"> </w:t>
+      </w:r>
+      <w:r>
+        <w:t xml:space="preserve">연산 데이터는</w:t>
+      </w:r>
+      <w:r>
+        <w:t xml:space="preserve"> </w:t>
+      </w:r>
+      <w:r>
+        <w:rPr>
+          <w:rStyle w:val="VerbatimChar"/>
+        </w:rPr>
+        <w:t xml:space="preserve">param1+</w:t>
+      </w:r>
+      <w:r>
+        <w:t xml:space="preserve">에 온다.</w:t>
+      </w:r>
+      <w:r>
+        <w:t xml:space="preserve"> </w:t>
+      </w:r>
+      <w:r>
+        <w:rPr>
+          <w:rStyle w:val="VerbatimChar"/>
+        </w:rPr>
+        <w:t xml:space="preserve">NCMP_HOST_MANAGED_CTX</w:t>
+      </w:r>
+      <w:r>
+        <w:t xml:space="preserve"> </w:t>
+      </w:r>
+      <w:r>
+        <w:t xml:space="preserve">빌드에서는 comm_thread가</w:t>
+      </w:r>
+      <w:r>
+        <w:t xml:space="preserve"> </w:t>
+      </w:r>
+      <w:r>
+        <w:t xml:space="preserve">id↔blob을 교환한다(§11 참조). 복호화 태그 불일치 시</w:t>
+      </w:r>
+      <w:r>
+        <w:t xml:space="preserve"> </w:t>
+      </w:r>
+      <w:r>
+        <w:rPr>
+          <w:rStyle w:val="VerbatimChar"/>
+        </w:rPr>
+        <w:t xml:space="preserve">ack = CKR_ENCRYPTED_DATA_INVALID</w:t>
+      </w:r>
+      <w:r>
+        <w:t xml:space="preserve">.</w:t>
+      </w:r>
+    </w:p>
+    <w:p>
       <w:r>
         <w:pict>
           <v:rect style="width:0;height:1.5pt" o:hralign="center" o:hrstd="t" o:hr="t"/>
@@ -3777,11 +4123,11 @@
       <w:pPr>
         <w:pStyle w:val="Heading2"/>
       </w:pPr>
-      <w:bookmarkStart w:id="39" w:name="X37dbe9f61af5fbaa95d101298d987fd5725f2db"/>
+      <w:bookmarkStart w:id="40" w:name="X37dbe9f61af5fbaa95d101298d987fd5725f2db"/>
       <w:r>
         <w:t xml:space="preserve">5. 토큰 관리 / 로그인 / 조회 명령</w:t>
       </w:r>
-      <w:bookmarkEnd w:id="39"/>
+      <w:bookmarkEnd w:id="40"/>
     </w:p>
     <w:p>
       <w:pPr>
@@ -3975,11 +4321,11 @@
       <w:pPr>
         <w:pStyle w:val="Heading3"/>
       </w:pPr>
-      <w:bookmarkStart w:id="40" w:name="X6f8001859cc6ac0746d189fe71a67ae55223eb0"/>
+      <w:bookmarkStart w:id="41" w:name="X6f8001859cc6ac0746d189fe71a67ae55223eb0"/>
       <w:r>
         <w:t xml:space="preserve">5.1 CI_CMD_LOGIN (0x0030)</w:t>
       </w:r>
-      <w:bookmarkEnd w:id="40"/>
+      <w:bookmarkEnd w:id="41"/>
     </w:p>
     <w:p>
       <w:pPr>
@@ -4364,11 +4710,11 @@
       <w:pPr>
         <w:pStyle w:val="Heading3"/>
       </w:pPr>
-      <w:bookmarkStart w:id="41" w:name="X13325cd30b433d4ecb862e9e6abdc2f9ff6adc3"/>
+      <w:bookmarkStart w:id="42" w:name="X13325cd30b433d4ecb862e9e6abdc2f9ff6adc3"/>
       <w:r>
         <w:t xml:space="preserve">5.2 CI_CMD_LOGOUT (0x0031)</w:t>
       </w:r>
-      <w:bookmarkEnd w:id="41"/>
+      <w:bookmarkEnd w:id="42"/>
     </w:p>
     <w:p>
       <w:pPr>
@@ -4454,11 +4800,11 @@
       <w:pPr>
         <w:pStyle w:val="Heading3"/>
       </w:pPr>
-      <w:bookmarkStart w:id="42" w:name="X3e426fd1f4c410b6ad7d032f202b9e0a6e021d8"/>
+      <w:bookmarkStart w:id="43" w:name="X3e426fd1f4c410b6ad7d032f202b9e0a6e021d8"/>
       <w:r>
         <w:t xml:space="preserve">5.3 CI_CMD_INIT_PIN (0x0032) — SO가 사용자 PIN 설정</w:t>
       </w:r>
-      <w:bookmarkEnd w:id="42"/>
+      <w:bookmarkEnd w:id="43"/>
     </w:p>
     <w:p>
       <w:pPr>
@@ -4568,11 +4914,11 @@
       <w:pPr>
         <w:pStyle w:val="Heading3"/>
       </w:pPr>
-      <w:bookmarkStart w:id="43" w:name="X5859e810924c0453b9edabef27ec584d8d6a442"/>
+      <w:bookmarkStart w:id="44" w:name="X5859e810924c0453b9edabef27ec584d8d6a442"/>
       <w:r>
         <w:t xml:space="preserve">5.4 CI_CMD_SET_PIN (0x0033) — PIN 변경</w:t>
       </w:r>
-      <w:bookmarkEnd w:id="43"/>
+      <w:bookmarkEnd w:id="44"/>
     </w:p>
     <w:p>
       <w:pPr>
@@ -4709,11 +5055,11 @@
       <w:pPr>
         <w:pStyle w:val="Heading3"/>
       </w:pPr>
-      <w:bookmarkStart w:id="44" w:name="X67d44dd1e7a34c0c2f0acff9ddcfbd9311cb3e1"/>
+      <w:bookmarkStart w:id="45" w:name="X67d44dd1e7a34c0c2f0acff9ddcfbd9311cb3e1"/>
       <w:r>
         <w:t xml:space="preserve">5.5 CI_CMD_INIT_TOKEN (0x0034) — 토큰 초기화</w:t>
       </w:r>
-      <w:bookmarkEnd w:id="44"/>
+      <w:bookmarkEnd w:id="45"/>
     </w:p>
     <w:p>
       <w:pPr>
@@ -4975,11 +5321,11 @@
       <w:pPr>
         <w:pStyle w:val="Heading3"/>
       </w:pPr>
-      <w:bookmarkStart w:id="45" w:name="X0b1dfc6631aaf15a96198b02ed45c75b2381c0c"/>
+      <w:bookmarkStart w:id="46" w:name="X0b1dfc6631aaf15a96198b02ed45c75b2381c0c"/>
       <w:r>
         <w:t xml:space="preserve">5.6 CI_CMD_GET_UTC_TIME (0x0035) — UTC 시각 조회</w:t>
       </w:r>
-      <w:bookmarkEnd w:id="45"/>
+      <w:bookmarkEnd w:id="46"/>
     </w:p>
     <w:p>
       <w:pPr>
@@ -5136,11 +5482,11 @@
       <w:pPr>
         <w:pStyle w:val="Heading3"/>
       </w:pPr>
-      <w:bookmarkStart w:id="46" w:name="X12995e6736b11b68fba6b0adf4c7325d6f72d74"/>
+      <w:bookmarkStart w:id="47" w:name="X12995e6736b11b68fba6b0adf4c7325d6f72d74"/>
       <w:r>
         <w:t xml:space="preserve">5.7 CI_CMD_GET_TOKEN_PARAMS (0x0036) — 라벨·시리얼·PIN 길이 조회</w:t>
       </w:r>
-      <w:bookmarkEnd w:id="46"/>
+      <w:bookmarkEnd w:id="47"/>
     </w:p>
     <w:p>
       <w:pPr>
@@ -5396,11 +5742,11 @@
       <w:pPr>
         <w:pStyle w:val="Heading3"/>
       </w:pPr>
-      <w:bookmarkStart w:id="47" w:name="X020bc2c874e1bf66b492be8cb28bba0b4fd752b"/>
+      <w:bookmarkStart w:id="48" w:name="X020bc2c874e1bf66b492be8cb28bba0b4fd752b"/>
       <w:r>
         <w:t xml:space="preserve">5.8 CI_CMD_SET_UTC_TIME (0x0037) — UTC 시각 설정</w:t>
       </w:r>
-      <w:bookmarkEnd w:id="47"/>
+      <w:bookmarkEnd w:id="48"/>
     </w:p>
     <w:p>
       <w:pPr>
@@ -5617,11 +5963,11 @@
       <w:pPr>
         <w:pStyle w:val="Heading3"/>
       </w:pPr>
-      <w:bookmarkStart w:id="48" w:name="Xbc9366e2755619c9cc3cd5bc42ff9d74ec48823"/>
+      <w:bookmarkStart w:id="49" w:name="Xbc9366e2755619c9cc3cd5bc42ff9d74ec48823"/>
       <w:r>
         <w:t xml:space="preserve">5.9 CI_CMD_OBJECT_ADD (0x0038) — 키 객체 등록/임포트</w:t>
       </w:r>
-      <w:bookmarkEnd w:id="48"/>
+      <w:bookmarkEnd w:id="49"/>
     </w:p>
     <w:p>
       <w:pPr>
@@ -5838,11 +6184,11 @@
       <w:pPr>
         <w:pStyle w:val="Heading3"/>
       </w:pPr>
-      <w:bookmarkStart w:id="49" w:name="X045c86323eb845f2ab596ac357f593176ede10c"/>
+      <w:bookmarkStart w:id="50" w:name="X045c86323eb845f2ab596ac357f593176ede10c"/>
       <w:r>
         <w:t xml:space="preserve">5.10 CI_CMD_OBJECT_SET_ATTR (0x0039) — 키 속성 변경 검증</w:t>
       </w:r>
-      <w:bookmarkEnd w:id="49"/>
+      <w:bookmarkEnd w:id="50"/>
     </w:p>
     <w:p>
       <w:pPr>
@@ -6051,11 +6397,11 @@
       <w:pPr>
         <w:pStyle w:val="Heading2"/>
       </w:pPr>
-      <w:bookmarkStart w:id="50" w:name="X3a71b2db853bd9b7c028d9a653c8871c1c44e85"/>
+      <w:bookmarkStart w:id="51" w:name="X3a71b2db853bd9b7c028d9a653c8871c1c44e85"/>
       <w:r>
         <w:t xml:space="preserve">7. 포스트양자 명령 (PKCS#11 3.2)</w:t>
       </w:r>
-      <w:bookmarkEnd w:id="50"/>
+      <w:bookmarkEnd w:id="51"/>
     </w:p>
     <w:p>
       <w:pPr>
@@ -6251,11 +6597,11 @@
       <w:pPr>
         <w:pStyle w:val="Heading3"/>
       </w:pPr>
-      <w:bookmarkStart w:id="51" w:name="X56fcaa2235853c1551785d98a3c381dfa876c9c"/>
+      <w:bookmarkStart w:id="52" w:name="X56fcaa2235853c1551785d98a3c381dfa876c9c"/>
       <w:r>
         <w:t xml:space="preserve">7.1 CI_CMD_MLDSA_KEYGEN (0x0050)</w:t>
       </w:r>
-      <w:bookmarkEnd w:id="51"/>
+      <w:bookmarkEnd w:id="52"/>
     </w:p>
     <w:p>
       <w:pPr>
@@ -6470,11 +6816,11 @@
       <w:pPr>
         <w:pStyle w:val="Heading3"/>
       </w:pPr>
-      <w:bookmarkStart w:id="52" w:name="X058f470219b2b65f092c5bcb9cdef07977ba788"/>
+      <w:bookmarkStart w:id="53" w:name="X058f470219b2b65f092c5bcb9cdef07977ba788"/>
       <w:r>
         <w:t xml:space="preserve">7.2 CI_CMD_MLDSA_SIGN (0x0051)</w:t>
       </w:r>
-      <w:bookmarkEnd w:id="52"/>
+      <w:bookmarkEnd w:id="53"/>
     </w:p>
     <w:p>
       <w:pPr>
@@ -6716,11 +7062,11 @@
       <w:pPr>
         <w:pStyle w:val="Heading3"/>
       </w:pPr>
-      <w:bookmarkStart w:id="53" w:name="X343ae1c64286360739da513cf28f8d4d6df587b"/>
+      <w:bookmarkStart w:id="54" w:name="X343ae1c64286360739da513cf28f8d4d6df587b"/>
       <w:r>
         <w:t xml:space="preserve">7.3 CI_CMD_MLDSA_VERIFY (0x0052)</w:t>
       </w:r>
-      <w:bookmarkEnd w:id="53"/>
+      <w:bookmarkEnd w:id="54"/>
     </w:p>
     <w:p>
       <w:pPr>
@@ -6911,11 +7257,11 @@
       <w:pPr>
         <w:pStyle w:val="Heading3"/>
       </w:pPr>
-      <w:bookmarkStart w:id="54" w:name="X0ed7672c19374fac8d8d0f7590a32f4cb491a43"/>
+      <w:bookmarkStart w:id="55" w:name="X0ed7672c19374fac8d8d0f7590a32f4cb491a43"/>
       <w:r>
         <w:t xml:space="preserve">7.4 CI_CMD_MLKEM_KEYGEN (0x0053)</w:t>
       </w:r>
-      <w:bookmarkEnd w:id="54"/>
+      <w:bookmarkEnd w:id="55"/>
     </w:p>
     <w:p>
       <w:pPr>
@@ -7130,11 +7476,11 @@
       <w:pPr>
         <w:pStyle w:val="Heading3"/>
       </w:pPr>
-      <w:bookmarkStart w:id="55" w:name="X40a9cb15b2e4108b014c9e70fcc231d27a91851"/>
+      <w:bookmarkStart w:id="56" w:name="X40a9cb15b2e4108b014c9e70fcc231d27a91851"/>
       <w:r>
         <w:t xml:space="preserve">7.5 CI_CMD_MLKEM_ENCAPS (0x0054) — 캡슐화</w:t>
       </w:r>
-      <w:bookmarkEnd w:id="55"/>
+      <w:bookmarkEnd w:id="56"/>
     </w:p>
     <w:p>
       <w:pPr>
@@ -7376,11 +7722,11 @@
       <w:pPr>
         <w:pStyle w:val="Heading3"/>
       </w:pPr>
-      <w:bookmarkStart w:id="56" w:name="X280bebf00f66d5524a9091e333f95b1a51f53c0"/>
+      <w:bookmarkStart w:id="57" w:name="X280bebf00f66d5524a9091e333f95b1a51f53c0"/>
       <w:r>
         <w:t xml:space="preserve">7.6 CI_CMD_MLKEM_DECAPS (0x0055) — 역캡슐화</w:t>
       </w:r>
-      <w:bookmarkEnd w:id="56"/>
+      <w:bookmarkEnd w:id="57"/>
     </w:p>
     <w:p>
       <w:pPr>
@@ -7629,11 +7975,11 @@
       <w:pPr>
         <w:pStyle w:val="Heading2"/>
       </w:pPr>
-      <w:bookmarkStart w:id="57" w:name="Xf47e9ef68df8f51c480c91d940956ed1af45ade"/>
+      <w:bookmarkStart w:id="58" w:name="Xf47e9ef68df8f51c480c91d940956ed1af45ade"/>
       <w:r>
         <w:t xml:space="preserve">8. 벤더 정의 명령 (datapath / 디바이스 상태)</w:t>
       </w:r>
-      <w:bookmarkEnd w:id="57"/>
+      <w:bookmarkEnd w:id="58"/>
     </w:p>
     <w:p>
       <w:pPr>
@@ -7703,11 +8049,11 @@
       <w:pPr>
         <w:pStyle w:val="Heading3"/>
       </w:pPr>
-      <w:bookmarkStart w:id="58" w:name="Xf5cdeb5b1c09485f5521ee8e925a0a37b1fbb8e"/>
+      <w:bookmarkStart w:id="59" w:name="Xf5cdeb5b1c09485f5521ee8e925a0a37b1fbb8e"/>
       <w:r>
         <w:t xml:space="preserve">8.1 CI_CMD_VD_MEM_WRITE (0x0101)</w:t>
       </w:r>
-      <w:bookmarkEnd w:id="58"/>
+      <w:bookmarkEnd w:id="59"/>
     </w:p>
     <w:p>
       <w:pPr>
@@ -7844,11 +8190,11 @@
       <w:pPr>
         <w:pStyle w:val="Heading3"/>
       </w:pPr>
-      <w:bookmarkStart w:id="59" w:name="X33cc993a948e5971fbd694f2fbeb09eecaf793b"/>
+      <w:bookmarkStart w:id="60" w:name="X33cc993a948e5971fbd694f2fbeb09eecaf793b"/>
       <w:r>
         <w:t xml:space="preserve">8.2 CI_CMD_VD_MEM_READ (0x0102)</w:t>
       </w:r>
-      <w:bookmarkEnd w:id="59"/>
+      <w:bookmarkEnd w:id="60"/>
     </w:p>
     <w:p>
       <w:pPr>
@@ -7997,11 +8343,11 @@
       <w:pPr>
         <w:pStyle w:val="Heading3"/>
       </w:pPr>
-      <w:bookmarkStart w:id="60" w:name="X145e5d437a31c6488a9a649f96ada2fcc1752d8"/>
+      <w:bookmarkStart w:id="61" w:name="X145e5d437a31c6488a9a649f96ada2fcc1752d8"/>
       <w:r>
         <w:t xml:space="preserve">8.3 CI_CMD_VD_PING (0x0103)</w:t>
       </w:r>
-      <w:bookmarkEnd w:id="60"/>
+      <w:bookmarkEnd w:id="61"/>
     </w:p>
     <w:p>
       <w:pPr>
@@ -8099,11 +8445,11 @@
       <w:pPr>
         <w:pStyle w:val="Heading3"/>
       </w:pPr>
-      <w:bookmarkStart w:id="61" w:name="X15030c94f93d52d02d642685dfc7af94e33a813"/>
+      <w:bookmarkStart w:id="62" w:name="X15030c94f93d52d02d642685dfc7af94e33a813"/>
       <w:r>
         <w:t xml:space="preserve">8.4 CI_CMD_VD_SELFTEST (0x0104)</w:t>
       </w:r>
-      <w:bookmarkEnd w:id="61"/>
+      <w:bookmarkEnd w:id="62"/>
     </w:p>
     <w:p>
       <w:pPr>
@@ -8213,11 +8559,11 @@
       <w:pPr>
         <w:pStyle w:val="Heading3"/>
       </w:pPr>
-      <w:bookmarkStart w:id="62" w:name="X6a1df7a8dc1c903e3aead87f38484a0f0483d05"/>
+      <w:bookmarkStart w:id="63" w:name="X6a1df7a8dc1c903e3aead87f38484a0f0483d05"/>
       <w:r>
         <w:t xml:space="preserve">8.5 CI_CMD_VD_FW_INFO (0x0105)</w:t>
       </w:r>
-      <w:bookmarkEnd w:id="62"/>
+      <w:bookmarkEnd w:id="63"/>
     </w:p>
     <w:p>
       <w:pPr>
@@ -8414,11 +8760,11 @@
       <w:pPr>
         <w:pStyle w:val="Heading3"/>
       </w:pPr>
-      <w:bookmarkStart w:id="63" w:name="X5fc009502b236ee93edfa5fa2273b7080a4941a"/>
+      <w:bookmarkStart w:id="64" w:name="X5fc009502b236ee93edfa5fa2273b7080a4941a"/>
       <w:r>
         <w:t xml:space="preserve">8.6 CI_CMD_VD_MEM_FILL (0x0106)</w:t>
       </w:r>
-      <w:bookmarkEnd w:id="63"/>
+      <w:bookmarkEnd w:id="64"/>
     </w:p>
     <w:p>
       <w:pPr>
@@ -8582,11 +8928,11 @@
       <w:pPr>
         <w:pStyle w:val="Heading3"/>
       </w:pPr>
-      <w:bookmarkStart w:id="64" w:name="X81c8b57be77d8231d97e1d5e9c2782b343dff1d"/>
+      <w:bookmarkStart w:id="65" w:name="X81c8b57be77d8231d97e1d5e9c2782b343dff1d"/>
       <w:r>
         <w:t xml:space="preserve">8.7 CI_CMD_VD_MEM_CRC (0x0107)</w:t>
       </w:r>
-      <w:bookmarkEnd w:id="64"/>
+      <w:bookmarkEnd w:id="65"/>
     </w:p>
     <w:p>
       <w:pPr>
@@ -8735,11 +9081,11 @@
       <w:pPr>
         <w:pStyle w:val="Heading3"/>
       </w:pPr>
-      <w:bookmarkStart w:id="65" w:name="X4b00743737cd512b8b99f3f3f275323f09da084"/>
+      <w:bookmarkStart w:id="66" w:name="X4b00743737cd512b8b99f3f3f275323f09da084"/>
       <w:r>
         <w:t xml:space="preserve">8.8 CI_CMD_VD_TOKEN_INFO (0x0108) — 토큰 정체성 조회</w:t>
       </w:r>
-      <w:bookmarkEnd w:id="65"/>
+      <w:bookmarkEnd w:id="66"/>
     </w:p>
     <w:p>
       <w:pPr>
@@ -9177,11 +9523,11 @@
       <w:pPr>
         <w:pStyle w:val="Heading2"/>
       </w:pPr>
-      <w:bookmarkStart w:id="66" w:name="Xa0d1f01fb20fd76a219c4d7c7556f35de6cbdaa"/>
+      <w:bookmarkStart w:id="67" w:name="Xa0d1f01fb20fd76a219c4d7c7556f35de6cbdaa"/>
       <w:r>
         <w:t xml:space="preserve">9. 응답 상태 코드 (header.ack)</w:t>
       </w:r>
-      <w:bookmarkEnd w:id="66"/>
+      <w:bookmarkEnd w:id="67"/>
     </w:p>
     <w:p>
       <w:pPr>
@@ -9775,11 +10121,11 @@
       <w:pPr>
         <w:pStyle w:val="Heading2"/>
       </w:pPr>
-      <w:bookmarkStart w:id="67" w:name="Xe4ac9aab03aad5a29eb2094abcc9f2280f78c8a"/>
+      <w:bookmarkStart w:id="68" w:name="Xe4ac9aab03aad5a29eb2094abcc9f2280f78c8a"/>
       <w:r>
         <w:t xml:space="preserve">10. 호스트 어댑터 대응 (참고)</w:t>
       </w:r>
-      <w:bookmarkEnd w:id="67"/>
+      <w:bookmarkEnd w:id="68"/>
     </w:p>
     <w:tbl>
       <w:tblPr>
@@ -10114,6 +10460,320 @@
         <w:t xml:space="preserve">동일한 CI 프레임/파라미터 규약을 따르되 진짜 암호 연산을 수행한다.</w:t>
       </w:r>
     </w:p>
+    <w:p>
+      <w:r>
+        <w:pict>
+          <v:rect style="width:0;height:1.5pt" o:hralign="center" o:hrstd="t" o:hr="t"/>
+        </w:pict>
+      </w:r>
+    </w:p>
+    <w:p>
+      <w:pPr>
+        <w:pStyle w:val="Heading2"/>
+      </w:pPr>
+      <w:bookmarkStart w:id="69" w:name="X0bc3be8740781e09d6737066707546f3a4dcdb3"/>
+      <w:r>
+        <w:t xml:space="preserve">11. 멀티파트 컨텍스트 모델 (컴파일 옵션)</w:t>
+      </w:r>
+      <w:bookmarkEnd w:id="69"/>
+    </w:p>
+    <w:p>
+      <w:pPr>
+        <w:pStyle w:val="FirstParagraph"/>
+      </w:pPr>
+      <w:r>
+        <w:t xml:space="preserve">멀티파트 연산(INIT/UPDATE/FINAL 계열: 다이제스트, AES-GCM)은 연산별 컨텍스트를</w:t>
+      </w:r>
+      <w:r>
+        <w:t xml:space="preserve"> </w:t>
+      </w:r>
+      <w:r>
+        <w:t xml:space="preserve">유지한다. 컨텍스트 보관 위치는</w:t>
+      </w:r>
+      <w:r>
+        <w:t xml:space="preserve"> </w:t>
+      </w:r>
+      <w:r>
+        <w:rPr>
+          <w:b/>
+        </w:rPr>
+        <w:t xml:space="preserve">데몬 빌드 시</w:t>
+      </w:r>
+      <w:r>
+        <w:t xml:space="preserve"> </w:t>
+      </w:r>
+      <w:r>
+        <w:rPr>
+          <w:rStyle w:val="VerbatimChar"/>
+        </w:rPr>
+        <w:t xml:space="preserve">NCMP_HOST_MANAGED_CTX</w:t>
+      </w:r>
+      <w:r>
+        <w:t xml:space="preserve"> </w:t>
+      </w:r>
+      <w:r>
+        <w:t xml:space="preserve">매크로</w:t>
+      </w:r>
+      <w:r>
+        <w:t xml:space="preserve"> </w:t>
+      </w:r>
+      <w:r>
+        <w:t xml:space="preserve">(CMake 옵션, 기본 OFF)로 선택한다.</w:t>
+      </w:r>
+    </w:p>
+    <w:p>
+      <w:pPr>
+        <w:numPr>
+          <w:ilvl w:val="0"/>
+          <w:numId w:val="1005"/>
+        </w:numPr>
+        <w:pStyle w:val="Compact"/>
+      </w:pPr>
+      <w:r>
+        <w:rPr>
+          <w:b/>
+        </w:rPr>
+        <w:t xml:space="preserve">기본(매크로 OFF)</w:t>
+      </w:r>
+      <w:r>
+        <w:t xml:space="preserve">: 물리 토큰이 컨텍스트를 소유한다. INIT이 컨텍스트 id를</w:t>
+      </w:r>
+      <w:r>
+        <w:t xml:space="preserve"> </w:t>
+      </w:r>
+      <w:r>
+        <w:t xml:space="preserve">반환하고 UPDATE/FINAL이 그 id를 전달하며 토큰이 상태를 보관한다.</w:t>
+      </w:r>
+    </w:p>
+    <w:p>
+      <w:pPr>
+        <w:numPr>
+          <w:ilvl w:val="0"/>
+          <w:numId w:val="1005"/>
+        </w:numPr>
+        <w:pStyle w:val="Compact"/>
+      </w:pPr>
+      <w:r>
+        <w:rPr>
+          <w:rStyle w:val="VerbatimChar"/>
+          <w:b/>
+        </w:rPr>
+        <w:t xml:space="preserve">NCMP_HOST_MANAGED_CTX</w:t>
+      </w:r>
+      <w:r>
+        <w:rPr>
+          <w:b/>
+        </w:rPr>
+        <w:t xml:space="preserve">(매크로 ON)</w:t>
+      </w:r>
+      <w:r>
+        <w:t xml:space="preserve">: 토큰이 무상태가 된다(HSM 저장 공간 부족</w:t>
+      </w:r>
+      <w:r>
+        <w:t xml:space="preserve"> </w:t>
+      </w:r>
+      <w:r>
+        <w:t xml:space="preserve">대응). 토큰은 INIT과 매 UPDATE에서 컨텍스트 blob 전체를 반환하고 UPDATE/FINAL에서</w:t>
+      </w:r>
+      <w:r>
+        <w:t xml:space="preserve"> </w:t>
+      </w:r>
+      <w:r>
+        <w:t xml:space="preserve">blob을 다시 받는다. 데몬</w:t>
+      </w:r>
+      <w:r>
+        <w:t xml:space="preserve"> </w:t>
+      </w:r>
+      <w:r>
+        <w:rPr>
+          <w:rStyle w:val="VerbatimChar"/>
+        </w:rPr>
+        <w:t xml:space="preserve">comm_thread</w:t>
+      </w:r>
+      <w:r>
+        <w:t xml:space="preserve">가 blob을 호스트측에 보관하고 작은 id로</w:t>
+      </w:r>
+      <w:r>
+        <w:t xml:space="preserve"> </w:t>
+      </w:r>
+      <w:r>
+        <w:t xml:space="preserve">중계하므로 STDLL은 변경되지 않는다.</w:t>
+      </w:r>
+    </w:p>
+    <w:p>
+      <w:pPr>
+        <w:pStyle w:val="FirstParagraph"/>
+      </w:pPr>
+      <w:r>
+        <w:t xml:space="preserve">규약:</w:t>
+      </w:r>
+      <w:r>
+        <w:t xml:space="preserve"> </w:t>
+      </w:r>
+      <w:r>
+        <w:rPr>
+          <w:rStyle w:val="VerbatimChar"/>
+        </w:rPr>
+        <w:t xml:space="preserve">param0</w:t>
+      </w:r>
+      <w:r>
+        <w:t xml:space="preserve">은 INIT 응답과 UPDATE/FINAL 요청에서 컨텍스트 슬롯(STDLL=id,</w:t>
+      </w:r>
+      <w:r>
+        <w:t xml:space="preserve"> </w:t>
+      </w:r>
+      <w:r>
+        <w:t xml:space="preserve">토큰=blob)이며, 연산 데이터는</w:t>
+      </w:r>
+      <w:r>
+        <w:t xml:space="preserve"> </w:t>
+      </w:r>
+      <w:r>
+        <w:rPr>
+          <w:rStyle w:val="VerbatimChar"/>
+        </w:rPr>
+        <w:t xml:space="preserve">param1+</w:t>
+      </w:r>
+      <w:r>
+        <w:t xml:space="preserve">에 온다. 브리지는</w:t>
+      </w:r>
+      <w:r>
+        <w:t xml:space="preserve"> </w:t>
+      </w:r>
+      <w:r>
+        <w:rPr>
+          <w:rStyle w:val="VerbatimChar"/>
+        </w:rPr>
+        <w:t xml:space="preserve">ncmp/daemon/comm_thread.c</w:t>
+      </w:r>
+      <w:r>
+        <w:t xml:space="preserve">의</w:t>
+      </w:r>
+      <w:r>
+        <w:t xml:space="preserve"> </w:t>
+      </w:r>
+      <w:r>
+        <w:rPr>
+          <w:rStyle w:val="VerbatimChar"/>
+        </w:rPr>
+        <w:t xml:space="preserve">ctx_xform_request</w:t>
+      </w:r>
+      <w:r>
+        <w:t xml:space="preserve">/</w:t>
+      </w:r>
+      <w:r>
+        <w:rPr>
+          <w:rStyle w:val="VerbatimChar"/>
+        </w:rPr>
+        <w:t xml:space="preserve">ctx_xform_response</w:t>
+      </w:r>
+      <w:r>
+        <w:t xml:space="preserve">가 담당하고</w:t>
+      </w:r>
+      <w:r>
+        <w:t xml:space="preserve"> </w:t>
+      </w:r>
+      <w:r>
+        <w:rPr>
+          <w:rStyle w:val="VerbatimChar"/>
+        </w:rPr>
+        <w:t xml:space="preserve">ctx_phase_of()</w:t>
+      </w:r>
+      <w:r>
+        <w:t xml:space="preserve">로 대상 opcode를 분류한다. STDLL은 UPDATE 청크에</w:t>
+      </w:r>
+      <w:r>
+        <w:t xml:space="preserve"> </w:t>
+      </w:r>
+      <w:r>
+        <w:rPr>
+          <w:rStyle w:val="VerbatimChar"/>
+        </w:rPr>
+        <w:t xml:space="preserve">NCMP_HOST_CTX_BLOB_MAX</w:t>
+      </w:r>
+      <w:r>
+        <w:t xml:space="preserve">만큼 여유를 두어 id→blob 치환 시 프레임이 넘치지 않게 한다.</w:t>
+      </w:r>
+    </w:p>
+    <w:p>
+      <w:pPr>
+        <w:pStyle w:val="BodyText"/>
+      </w:pPr>
+      <w:r>
+        <w:t xml:space="preserve">단발 연산(AES-GCM one-shot, AES-CTR — 카운터를 매 명령에 실어 보냄)은 호출 간 토큰</w:t>
+      </w:r>
+      <w:r>
+        <w:t xml:space="preserve"> </w:t>
+      </w:r>
+      <w:r>
+        <w:t xml:space="preserve">상태가 없어 영향을 받지 않는다.</w:t>
+      </w:r>
+    </w:p>
+    <w:p>
+      <w:pPr>
+        <w:pStyle w:val="BodyText"/>
+      </w:pPr>
+      <w:r>
+        <w:t xml:space="preserve">멀티파트 연산을</w:t>
+      </w:r>
+      <w:r>
+        <w:t xml:space="preserve"> </w:t>
+      </w:r>
+      <w:r>
+        <w:rPr>
+          <w:rStyle w:val="VerbatimChar"/>
+        </w:rPr>
+        <w:t xml:space="preserve">*Final</w:t>
+      </w:r>
+      <w:r>
+        <w:t xml:space="preserve"> </w:t>
+      </w:r>
+      <w:r>
+        <w:t xml:space="preserve">없이 중단하면 STDLL 컨텍스트 해제 훅이</w:t>
+      </w:r>
+      <w:r>
+        <w:t xml:space="preserve"> </w:t>
+      </w:r>
+      <w:r>
+        <w:rPr>
+          <w:rStyle w:val="VerbatimChar"/>
+        </w:rPr>
+        <w:t xml:space="preserve">NCMP_CMD_CTX_FREE</w:t>
+      </w:r>
+      <w:r>
+        <w:t xml:space="preserve">(0x0017,</w:t>
+      </w:r>
+      <w:r>
+        <w:t xml:space="preserve"> </w:t>
+      </w:r>
+      <w:r>
+        <w:rPr>
+          <w:rStyle w:val="VerbatimChar"/>
+        </w:rPr>
+        <w:t xml:space="preserve">[ctx|kind]</w:t>
+      </w:r>
+      <w:r>
+        <w:t xml:space="preserve">)를 보내 컨텍스트를 회수한다.</w:t>
+      </w:r>
+      <w:r>
+        <w:t xml:space="preserve"> </w:t>
+      </w:r>
+      <w:r>
+        <w:rPr>
+          <w:rStyle w:val="VerbatimChar"/>
+        </w:rPr>
+        <w:t xml:space="preserve">NCMP_HOST_MANAGED_CTX</w:t>
+      </w:r>
+      <w:r>
+        <w:t xml:space="preserve">에서는 comm_thread가 호스트 슬롯을, 기본 빌드에서는 토큰이</w:t>
+      </w:r>
+      <w:r>
+        <w:t xml:space="preserve"> </w:t>
+      </w:r>
+      <w:r>
+        <w:t xml:space="preserve">자신의 테이블 항목을 해제한다. 멱등이며 teardown에서 best-effort로 동작한다.</w:t>
+      </w:r>
+    </w:p>
     <w:sectPr/>
   </w:body>
 </w:document>
@@ -10363,6 +11023,9 @@
     <w:abstractNumId w:val="991"/>
   </w:num>
   <w:num w:numId="1004">
+    <w:abstractNumId w:val="991"/>
+  </w:num>
+  <w:num w:numId="1005">
     <w:abstractNumId w:val="991"/>
   </w:num>
 </w:numbering>

</xml_diff>